<commit_message>
docs: synchronize closure evidence and audit labels
</commit_message>
<xml_diff>
--- a/deliverables/AQP_Manual_AT_Audit_v1.docx
+++ b/deliverables/AQP_Manual_AT_Audit_v1.docx
@@ -2,7 +2,7 @@
 <file path=word/document.xml><?xml version="1.0" encoding="utf-8"?>
 <w:document xmlns:w="http://schemas.openxmlformats.org/wordprocessingml/2006/main" xmlns:m="http://schemas.openxmlformats.org/officeDocument/2006/math" xmlns:r="http://schemas.openxmlformats.org/officeDocument/2006/relationships" xmlns:o="urn:schemas-microsoft-com:office:office" xmlns:v="urn:schemas-microsoft-com:vml" xmlns:w10="urn:schemas-microsoft-com:office:word" xmlns:a="http://schemas.openxmlformats.org/drawingml/2006/main" xmlns:pic="http://schemas.openxmlformats.org/drawingml/2006/picture" xmlns:wp="http://schemas.openxmlformats.org/drawingml/2006/wordprocessingDrawing">
   <w:body>
-    <w:bookmarkStart w:id="43" w:name="Xc3a032b4f8566cabdf6cf77ac00eb7cead9f3ae"/>
+    <w:bookmarkStart w:id="43" w:name="X5d5e0a0f5abbed04194999b12241b4c6638c135"/>
     <w:p>
       <w:pPr>
         <w:pStyle w:val="Heading1"/>
@@ -17,7 +17,7 @@
           <w:color w:val="000000"/>
           <w:sz w:val="46"/>
         </w:rPr>
-        <w:t xml:space="preserve">AQP manual assistive-technology audit v1.1</w:t>
+        <w:t xml:space="preserve">AQP manual assistive-technology audit v1.3</w:t>
       </w:r>
     </w:p>
     <w:p>
@@ -56,7 +56,7 @@
           <w:color w:val="59636E"/>
           <w:sz w:val="20"/>
         </w:rPr>
-        <w:t xml:space="preserve"> </w:t>
+        <w:br/>
       </w:r>
       <w:r>
         <w:rPr>
@@ -72,7 +72,7 @@
           <w:color w:val="59636E"/>
           <w:sz w:val="20"/>
         </w:rPr>
-        <w:t xml:space="preserve"> </w:t>
+        <w:br/>
       </w:r>
       <w:r>
         <w:rPr>
@@ -106,7 +106,7 @@
           <w:color w:val="59636E"/>
           <w:sz w:val="20"/>
         </w:rPr>
-        <w:t xml:space="preserve"> </w:t>
+        <w:br/>
       </w:r>
       <w:r>
         <w:rPr>
@@ -2713,7 +2713,7 @@
                 <w:rFonts w:ascii="Calibri" w:hAnsi="Calibri"/>
                 <w:sz w:val="15"/>
               </w:rPr>
-              <w:t xml:space="preserve">Expand and collapse “Adjust accessibility support (optional)”.</w:t>
+              <w:t xml:space="preserve">Expand and collapse “Accessibility and audio options (optional)”.</w:t>
             </w:r>
           </w:p>
         </w:tc>
@@ -6393,33 +6393,33 @@
                 <w:rFonts w:ascii="Calibri" w:hAnsi="Calibri"/>
                 <w:sz w:val="15"/>
               </w:rPr>
-              <w:t xml:space="preserve">Reach the SUS review screen and navigate each record.</w:t>
-            </w:r>
-          </w:p>
-        </w:tc>
-        <w:tc>
-          <w:tcPr>
-            <w:tcW w:type="dxa" w:w="1764"/>
-            <w:vAlign w:val="top"/>
-            <w:tcMar>
-              <w:top w:w="80" w:type="dxa"/>
-              <w:bottom w:w="80" w:type="dxa"/>
-              <w:start w:w="120" w:type="dxa"/>
-              <w:end w:w="120" w:type="dxa"/>
-            </w:tcMar>
-          </w:tcPr>
-          <w:p>
-            <w:pPr>
-              <w:pStyle w:val="Compact"/>
-              <w:spacing w:before="0" w:after="60" w:line="240" w:lineRule="auto"/>
-              <w:jc w:val="left"/>
-            </w:pPr>
-            <w:r>
-              <w:rPr>
-                <w:rFonts w:ascii="Calibri" w:hAnsi="Calibri"/>
-                <w:sz w:val="15"/>
-              </w:rPr>
-              <w:t xml:space="preserve">Every record exposes the full item statement, selected value and visible answer label. Its visible</w:t>
+              <w:t xml:space="preserve">Reach the SUS review screen and navigate each record. Pay particular attention to Item 3 = 4.</w:t>
+            </w:r>
+          </w:p>
+        </w:tc>
+        <w:tc>
+          <w:tcPr>
+            <w:tcW w:type="dxa" w:w="1764"/>
+            <w:vAlign w:val="top"/>
+            <w:tcMar>
+              <w:top w:w="80" w:type="dxa"/>
+              <w:bottom w:w="80" w:type="dxa"/>
+              <w:start w:w="120" w:type="dxa"/>
+              <w:end w:w="120" w:type="dxa"/>
+            </w:tcMar>
+          </w:tcPr>
+          <w:p>
+            <w:pPr>
+              <w:pStyle w:val="Compact"/>
+              <w:spacing w:before="0" w:after="60" w:line="240" w:lineRule="auto"/>
+              <w:jc w:val="left"/>
+            </w:pPr>
+            <w:r>
+              <w:rPr>
+                <w:rFonts w:ascii="Calibri" w:hAnsi="Calibri"/>
+                <w:sz w:val="15"/>
+              </w:rPr>
+              <w:t xml:space="preserve">Every record exposes the full item statement and selected value. If the questionnaire declares a label for that value, the label is visible; otherwise the declared scale endpoints are visible so the position can be interpreted without invented response wording. Its visible</w:t>
             </w:r>
             <w:r>
               <w:rPr>

</xml_diff>